<commit_message>
Add Lab07 - Streams & Lambdas
</commit_message>
<xml_diff>
--- a/src/L05_Files_IO/L05_File_IO_EN.docx
+++ b/src/L05_Files_IO/L05_File_IO_EN.docx
@@ -1050,15 +1050,7 @@
           <w:sz w:val="32"/>
           <w:szCs w:val="32"/>
         </w:rPr>
-        <w:t>BUFFERED READE</w:t>
-      </w:r>
-      <w:r>
-        <w:rPr>
-          <w:rStyle w:val="Hyperlink"/>
-          <w:sz w:val="32"/>
-          <w:szCs w:val="32"/>
-        </w:rPr>
-        <w:t>R</w:t>
+        <w:t>BUFFERED READER</w:t>
       </w:r>
     </w:p>
     <w:p>
@@ -1926,7 +1918,31 @@
           <w:sz w:val="56"/>
           <w:szCs w:val="56"/>
         </w:rPr>
-        <w:t>N.B.: UPLOAD ONLY THE JAVA FILES AND THE OUTPUT FILES.</w:t>
+        <w:t xml:space="preserve">N.B.: UPLOAD ONLY </w:t>
+      </w:r>
+      <w:r>
+        <w:rPr>
+          <w:rFonts w:ascii="Cascadia Code" w:hAnsi="Cascadia Code" w:cs="Cascadia Code"/>
+          <w:b/>
+          <w:bCs/>
+          <w:i/>
+          <w:iCs/>
+          <w:sz w:val="56"/>
+          <w:szCs w:val="56"/>
+        </w:rPr>
+        <w:t xml:space="preserve">SCREENSHOTS, </w:t>
+      </w:r>
+      <w:r>
+        <w:rPr>
+          <w:rFonts w:ascii="Cascadia Code" w:hAnsi="Cascadia Code" w:cs="Cascadia Code"/>
+          <w:b/>
+          <w:bCs/>
+          <w:i/>
+          <w:iCs/>
+          <w:sz w:val="56"/>
+          <w:szCs w:val="56"/>
+        </w:rPr>
+        <w:t>THE JAVA FILES AND THE OUTPUT FILES.</w:t>
       </w:r>
     </w:p>
     <w:p>

</xml_diff>